<commit_message>
actualizo para el examen bimestral 2
</commit_message>
<xml_diff>
--- a/SEMANA 9/Apuntes Herencia en POO.docx
+++ b/SEMANA 9/Apuntes Herencia en POO.docx
@@ -111,6 +111,12 @@
         </w:rPr>
         <w:t xml:space="preserve"> que contiene las propiedades comunes sirve como plantilla</w:t>
       </w:r>
+      <w:r>
+        <w:rPr>
+          <w:lang w:val="es-EC"/>
+        </w:rPr>
+        <w:t>.</w:t>
+      </w:r>
     </w:p>
     <w:p>
       <w:pPr>
@@ -151,7 +157,39 @@
         <w:rPr>
           <w:lang w:val="es-EC"/>
         </w:rPr>
-        <w:t xml:space="preserve"> que hereda de la superclase. Puede reutilizar lo que ya existe y añadir sus propios atributos o modificar lo que ya existe.</w:t>
+        <w:t xml:space="preserve"> que hereda de la </w:t>
+      </w:r>
+      <w:r>
+        <w:rPr>
+          <w:lang w:val="es-EC"/>
+        </w:rPr>
+        <w:t>superclase, puede</w:t>
+      </w:r>
+      <w:r>
+        <w:rPr>
+          <w:lang w:val="es-EC"/>
+        </w:rPr>
+        <w:t xml:space="preserve"> reutilizar lo que ya existe y añadir sus propios atributos</w:t>
+      </w:r>
+      <w:r>
+        <w:rPr>
+          <w:lang w:val="es-EC"/>
+        </w:rPr>
+        <w:t xml:space="preserve"> y/o </w:t>
+      </w:r>
+      <w:proofErr w:type="spellStart"/>
+      <w:r>
+        <w:rPr>
+          <w:lang w:val="es-EC"/>
+        </w:rPr>
+        <w:t>metodos</w:t>
+      </w:r>
+      <w:proofErr w:type="spellEnd"/>
+      <w:r>
+        <w:rPr>
+          <w:lang w:val="es-EC"/>
+        </w:rPr>
+        <w:t xml:space="preserve"> o modificar lo que ya existe.</w:t>
       </w:r>
     </w:p>
     <w:p>
@@ -204,7 +242,19 @@
         <w:rPr>
           <w:lang w:val="es-EC"/>
         </w:rPr>
-        <w:t xml:space="preserve"> en la herencia significa que partimos de un concepto general y creamos algo mas especifico. La clase hija hereda todo lo que la clase padre ya sabe hacer, pero añade sus propias características únicas.</w:t>
+        <w:t xml:space="preserve"> en la herencia significa que partimos de un concepto general y creamos algo </w:t>
+      </w:r>
+      <w:r>
+        <w:rPr>
+          <w:lang w:val="es-EC"/>
+        </w:rPr>
+        <w:t>más</w:t>
+      </w:r>
+      <w:r>
+        <w:rPr>
+          <w:lang w:val="es-EC"/>
+        </w:rPr>
+        <w:t xml:space="preserve"> especifico. La clase hija hereda todo lo que la clase padre ya sabe hacer, pero añade sus propias características únicas.</w:t>
       </w:r>
     </w:p>
     <w:p>
@@ -234,7 +284,19 @@
         <w:rPr>
           <w:lang w:val="es-EC"/>
         </w:rPr>
-        <w:t>: Es la relación mas directa y limpia entre una clase padre y una clase hija</w:t>
+        <w:t xml:space="preserve">: Es la relación </w:t>
+      </w:r>
+      <w:r>
+        <w:rPr>
+          <w:lang w:val="es-EC"/>
+        </w:rPr>
+        <w:t>más</w:t>
+      </w:r>
+      <w:r>
+        <w:rPr>
+          <w:lang w:val="es-EC"/>
+        </w:rPr>
+        <w:t xml:space="preserve"> directa y limpia entre una clase padre y una clase hija</w:t>
       </w:r>
       <w:r>
         <w:rPr>
@@ -370,7 +432,33 @@
         <w:rPr>
           <w:lang w:val="es-EC"/>
         </w:rPr>
-        <w:t xml:space="preserve"> puede heredar características y funciones de varias clases padres “””simultáneamente”””;  la forma más común y rentable es mediante una o </w:t>
+        <w:t xml:space="preserve"> puede heredar características y funciones de varias clases padres “</w:t>
+      </w:r>
+      <w:r>
+        <w:rPr>
+          <w:lang w:val="es-EC"/>
+        </w:rPr>
+        <w:t>”” simultáneamente</w:t>
+      </w:r>
+      <w:r>
+        <w:rPr>
+          <w:lang w:val="es-EC"/>
+        </w:rPr>
+        <w:t>””</w:t>
+      </w:r>
+      <w:proofErr w:type="gramStart"/>
+      <w:r>
+        <w:rPr>
+          <w:lang w:val="es-EC"/>
+        </w:rPr>
+        <w:t>”;  la</w:t>
+      </w:r>
+      <w:proofErr w:type="gramEnd"/>
+      <w:r>
+        <w:rPr>
+          <w:lang w:val="es-EC"/>
+        </w:rPr>
+        <w:t xml:space="preserve"> forma más común y rentable es mediante una o </w:t>
       </w:r>
       <w:r>
         <w:rPr>
@@ -393,6 +481,7 @@
       </w:pPr>
       <w:r>
         <w:rPr>
+          <w:noProof/>
           <w:lang w:val="es-EC"/>
         </w:rPr>
         <w:lastRenderedPageBreak/>
@@ -558,7 +647,31 @@
         <w:rPr>
           <w:lang w:val="es-EC"/>
         </w:rPr>
-        <w:t xml:space="preserve">La jerarquía define la estructura de clases a través de diferentes niveles de profundidad a medida que bajas en los niveles, las clases se vuelven más especificas (Subclases), a medida que subes, las clases se vuelven mas abstractas y generales (Superclases). </w:t>
+        <w:t xml:space="preserve">La jerarquía define la estructura de clases a través de diferentes niveles de profundidad a medida que bajas en los niveles, las clases se vuelven más </w:t>
+      </w:r>
+      <w:r>
+        <w:rPr>
+          <w:lang w:val="es-EC"/>
+        </w:rPr>
+        <w:t>específicas</w:t>
+      </w:r>
+      <w:r>
+        <w:rPr>
+          <w:lang w:val="es-EC"/>
+        </w:rPr>
+        <w:t xml:space="preserve"> (Subclases), a medida que subes, las clases se vuelven </w:t>
+      </w:r>
+      <w:r>
+        <w:rPr>
+          <w:lang w:val="es-EC"/>
+        </w:rPr>
+        <w:t>más</w:t>
+      </w:r>
+      <w:r>
+        <w:rPr>
+          <w:lang w:val="es-EC"/>
+        </w:rPr>
+        <w:t xml:space="preserve"> abstractas y generales (Superclases). </w:t>
       </w:r>
       <w:r>
         <w:rPr>
@@ -631,6 +744,7 @@
       </w:pPr>
       <w:r>
         <w:rPr>
+          <w:noProof/>
           <w:lang w:val="es-EC"/>
         </w:rPr>
         <w:lastRenderedPageBreak/>
@@ -701,7 +815,7 @@
         <w:rPr>
           <w:lang w:val="es-EC"/>
         </w:rPr>
-        <w:t>Es una referencia a la superclase inmediata., sirve para invocar constructores del padre</w:t>
+        <w:t>Es una referencia a la superclase inmediata, sirve para invocar constructores del padre</w:t>
       </w:r>
       <w:r>
         <w:rPr>
@@ -727,7 +841,47 @@
         <w:rPr>
           <w:lang w:val="es-EC"/>
         </w:rPr>
-        <w:t>Llamar a métodos ocultos, si la clase hija reescribió un método (polimorfismo), pero si  aún se necesita ejecutar la versión original, se usa super.nombreDelmetodo()  ósea le pones “super.” Seguido del nombre del método.</w:t>
+        <w:t xml:space="preserve">Llamar a métodos ocultos, si la clase hija reescribió un método (polimorfismo), pero </w:t>
+      </w:r>
+      <w:r>
+        <w:rPr>
+          <w:lang w:val="es-EC"/>
+        </w:rPr>
+        <w:t>si aún</w:t>
+      </w:r>
+      <w:r>
+        <w:rPr>
+          <w:lang w:val="es-EC"/>
+        </w:rPr>
+        <w:t xml:space="preserve"> se necesita ejecutar la versión original, se usa </w:t>
+      </w:r>
+      <w:proofErr w:type="spellStart"/>
+      <w:proofErr w:type="gramStart"/>
+      <w:r>
+        <w:rPr>
+          <w:lang w:val="es-EC"/>
+        </w:rPr>
+        <w:t>super.nombreDelmetodo</w:t>
+      </w:r>
+      <w:proofErr w:type="spellEnd"/>
+      <w:r>
+        <w:rPr>
+          <w:lang w:val="es-EC"/>
+        </w:rPr>
+        <w:t>()  ósea</w:t>
+      </w:r>
+      <w:proofErr w:type="gramEnd"/>
+      <w:r>
+        <w:rPr>
+          <w:lang w:val="es-EC"/>
+        </w:rPr>
+        <w:t xml:space="preserve"> le pones “super.” Seguido del nombre del método</w:t>
+      </w:r>
+      <w:r>
+        <w:rPr>
+          <w:lang w:val="es-EC"/>
+        </w:rPr>
+        <w:t xml:space="preserve"> así usando la versión original.</w:t>
       </w:r>
     </w:p>
     <w:p>
@@ -795,27 +949,55 @@
         <w:rPr>
           <w:lang w:val="es-EC"/>
         </w:rPr>
-        <w:t>: Si no se escribe nada el compilador busca al constructor por defecto( sin parámetros) de la superclase y lo ejecuta antes que el de la subclase.</w:t>
-      </w:r>
-    </w:p>
-    <w:p>
-      <w:pPr>
-        <w:rPr>
-          <w:lang w:val="es-EC"/>
-        </w:rPr>
-      </w:pPr>
-    </w:p>
-    <w:p>
-      <w:pPr>
-        <w:rPr>
-          <w:lang w:val="es-EC"/>
-        </w:rPr>
-      </w:pPr>
-      <w:r>
-        <w:rPr>
-          <w:lang w:val="es-EC"/>
-        </w:rPr>
-        <w:t>Explicita: Ocurre cuando se usa explícitamente la palabra Super en la primera línea del constructor de la subclase, es obligatorio si el padre no tiene un constructor por defecto y requiere parámetros específicos.</w:t>
+        <w:t xml:space="preserve">: Si no se escribe nada el compilador busca al constructor por </w:t>
+      </w:r>
+      <w:proofErr w:type="gramStart"/>
+      <w:r>
+        <w:rPr>
+          <w:lang w:val="es-EC"/>
+        </w:rPr>
+        <w:t>defecto(</w:t>
+      </w:r>
+      <w:proofErr w:type="gramEnd"/>
+      <w:r>
+        <w:rPr>
+          <w:lang w:val="es-EC"/>
+        </w:rPr>
+        <w:t>sin</w:t>
+      </w:r>
+      <w:r>
+        <w:rPr>
+          <w:lang w:val="es-EC"/>
+        </w:rPr>
+        <w:t xml:space="preserve"> parámetros) de la superclase y lo ejecuta antes que el de la subclase.</w:t>
+      </w:r>
+    </w:p>
+    <w:p>
+      <w:pPr>
+        <w:rPr>
+          <w:lang w:val="es-EC"/>
+        </w:rPr>
+      </w:pPr>
+    </w:p>
+    <w:p>
+      <w:pPr>
+        <w:rPr>
+          <w:lang w:val="es-EC"/>
+        </w:rPr>
+      </w:pPr>
+      <w:r>
+        <w:rPr>
+          <w:b/>
+          <w:bCs/>
+          <w:lang w:val="es-EC"/>
+        </w:rPr>
+        <w:t>Explicita</w:t>
+      </w:r>
+      <w:r>
+        <w:rPr>
+          <w:lang w:val="es-EC"/>
+        </w:rPr>
+        <w:t>: Ocurre cuando se usa explícitamente la palabra Super en la primera línea del constructor de la subclase, es obligatorio si el padre no tiene un constructor por defecto y requiere parámetros específicos.</w:t>
       </w:r>
     </w:p>
     <w:p>

</xml_diff>